<commit_message>
Remove organization name from CTO Voice Mastery Program
Replaced 3 occurrences of the company name with 'the organization'
to make the document generic and non-attributable.

Co-Authored-By: Claude Sonnet 4.6 <noreply@anthropic.com>
</commit_message>
<xml_diff>
--- a/docs/non-tech/CTO_Voice_Mastery_Program.docx
+++ b/docs/non-tech/CTO_Voice_Mastery_Program.docx
@@ -129,7 +129,7 @@
           <w:sz w:val="24"/>
           <w:szCs w:val="24"/>
         </w:rPr>
-        <w:t xml:space="preserve">Designed for a 20-Year Senior Architect at Infosys</w:t>
+        <w:t>Designed for a 20-Year Senior Architect at the organization</w:t>
       </w:r>
     </w:p>
     <w:p>
@@ -19227,7 +19227,7 @@
           <w:sz w:val="22"/>
           <w:szCs w:val="22"/>
         </w:rPr>
-        <w:t xml:space="preserve">At your level — 20 years, senior architect, Infosys — there will be difficult conversations every week. Someone needs to be told their approach is wrong. A stakeholder needs to hear bad news. A team member needs direct feedback. These are the moments where most senior professionals either avoid or over-escalate. Today we build your difficult conversation protocol. Based on Chris Voss's field-tested approach to the most difficult conversations imaginable: life-or-death negotiations. If it works there, it will work in your boardroom.</w:t>
+        <w:t>At your level — 20 years, senior architect, the organization — there will be difficult conversations every week. Someone needs to be told their approach is wrong. A stakeholder needs to hear bad news. A team member needs direct feedback. These are the moments where most senior professionals either avoid or over-escalate. Today we build your difficult conversation protocol. Based on Chris Voss's field-tested approach to the most difficult conversations imaginable: life-or-death negotiations. If it works there, it will work in your boardroom.</w:t>
       </w:r>
     </w:p>
     <w:p>
@@ -20673,7 +20673,7 @@
           <w:sz w:val="22"/>
           <w:szCs w:val="22"/>
         </w:rPr>
-        <w:t xml:space="preserve">Every great leader has a Signature Story. It is the one that defines them. Simon Sinek talking about the military. Brene Brown talking about vulnerability in the Houston hotel room. Steve Jobs talking about getting fired from Apple. These stories are not accidents. They were identified, crafted, refined, and deployed strategically. Today I want you to identify yours. Twenty years of Infosys, of architecture decisions, of late-night production crises, of moments where the technical and the human collided. One of those moments is your Signature Story. Find it.</w:t>
+        <w:t>Every great leader has a Signature Story. It is the one that defines them. Simon Sinek talking about the military. Brene Brown talking about vulnerability in the Houston hotel room. Steve Jobs talking about getting fired from Apple. These stories are not accidents. They were identified, crafted, refined, and deployed strategically. Today I want you to identify yours. Twenty years of the organization, of architecture decisions, of late-night production crises, of moments where the technical and the human collided. One of those moments is your Signature Story. Find it.</w:t>
       </w:r>
     </w:p>
     <w:p>

</xml_diff>